<commit_message>
Fix typos in general docs
</commit_message>
<xml_diff>
--- a/docs/General Docs.docx
+++ b/docs/General Docs.docx
@@ -45,7 +45,19 @@
           <w:szCs w:val="28"/>
           <w:lang w:val="en-US"/>
         </w:rPr>
-        <w:t>: User’s Guide/Documentation</w:t>
+        <w:t xml:space="preserve">: </w:t>
+      </w:r>
+      <w:bookmarkStart w:id="0" w:name="_GoBack"/>
+      <w:bookmarkEnd w:id="0"/>
+      <w:r>
+        <w:rPr>
+          <w:rFonts w:ascii="Times New Roman" w:hAnsi="Times New Roman"/>
+          <w:b/>
+          <w:sz w:val="28"/>
+          <w:szCs w:val="28"/>
+          <w:lang w:val="en-US"/>
+        </w:rPr>
+        <w:t>User’s Guide/Documentation</w:t>
       </w:r>
     </w:p>
     <w:p>
@@ -216,7 +228,21 @@
           <w:rFonts w:ascii="Times New Roman" w:hAnsi="Times New Roman"/>
           <w:lang w:val="en-US"/>
         </w:rPr>
-        <w:t>, check the “gamelist.ini” file and the game-specific documentation.</w:t>
+        <w:t>, check the “</w:t>
+      </w:r>
+      <w:r>
+        <w:rPr>
+          <w:rFonts w:ascii="Times New Roman" w:hAnsi="Times New Roman"/>
+          <w:lang w:val="en-US"/>
+        </w:rPr>
+        <w:t>rom</w:t>
+      </w:r>
+      <w:r>
+        <w:rPr>
+          <w:rFonts w:ascii="Times New Roman" w:hAnsi="Times New Roman"/>
+          <w:lang w:val="en-US"/>
+        </w:rPr>
+        <w:t>list.ini” file and the game-specific documentation.</w:t>
       </w:r>
       <w:r>
         <w:rPr>
@@ -4014,14 +4040,7 @@
           <w:rFonts w:ascii="Times New Roman" w:hAnsi="Times New Roman"/>
           <w:lang w:val="en-US"/>
         </w:rPr>
-        <w:t xml:space="preserve">. </w:t>
-      </w:r>
-      <w:r>
-        <w:rPr>
-          <w:rFonts w:ascii="Times New Roman" w:hAnsi="Times New Roman"/>
-          <w:lang w:val="en-US"/>
-        </w:rPr>
-        <w:t xml:space="preserve">These are </w:t>
+        <w:t xml:space="preserve">. These are </w:t>
       </w:r>
       <w:proofErr w:type="spellStart"/>
       <w:r>
@@ -4037,14 +4056,7 @@
           <w:rFonts w:ascii="Times New Roman" w:hAnsi="Times New Roman"/>
           <w:lang w:val="en-US"/>
         </w:rPr>
-        <w:t xml:space="preserve"> f</w:t>
-      </w:r>
-      <w:r>
-        <w:rPr>
-          <w:rFonts w:ascii="Times New Roman" w:hAnsi="Times New Roman"/>
-          <w:lang w:val="en-US"/>
-        </w:rPr>
-        <w:t>irst 3 trials out of the box</w:t>
+        <w:t xml:space="preserve"> first 3 trials out of the box</w:t>
       </w:r>
       <w:r>
         <w:rPr>
@@ -5545,13 +5557,6 @@
       <w:r>
         <w:rPr>
           <w:rFonts w:ascii="Times New Roman" w:hAnsi="Times New Roman"/>
-          <w:lang w:val="en-US"/>
-        </w:rPr>
-        <w:br/>
-      </w:r>
-      <w:r>
-        <w:rPr>
-          <w:rFonts w:ascii="Times New Roman" w:hAnsi="Times New Roman"/>
           <w:b/>
           <w:lang w:val="en-US"/>
         </w:rPr>
@@ -5806,12 +5811,21 @@
           <w:rFonts w:ascii="Times New Roman" w:hAnsi="Times New Roman"/>
           <w:lang w:val="en-US"/>
         </w:rPr>
-        <w:t xml:space="preserve"> variable called “</w:t>
+        <w:t xml:space="preserve"> variable called </w:t>
+      </w:r>
+      <w:r>
+        <w:rPr>
+          <w:rFonts w:ascii="Times New Roman" w:hAnsi="Times New Roman"/>
+          <w:i/>
+          <w:lang w:val="en-US"/>
+        </w:rPr>
+        <w:t>“</w:t>
       </w:r>
       <w:proofErr w:type="spellStart"/>
       <w:r>
         <w:rPr>
           <w:rFonts w:ascii="Times New Roman" w:hAnsi="Times New Roman"/>
+          <w:i/>
           <w:lang w:val="en-US"/>
         </w:rPr>
         <w:t>IsAirborne</w:t>
@@ -5820,9 +5834,17 @@
       <w:r>
         <w:rPr>
           <w:rFonts w:ascii="Times New Roman" w:hAnsi="Times New Roman"/>
-          <w:lang w:val="en-US"/>
-        </w:rPr>
-        <w:t xml:space="preserve">”. In order to enforce the requirement for hitting a mid-air opponent with an attack, you would write the following success condition: </w:t>
+          <w:i/>
+          <w:lang w:val="en-US"/>
+        </w:rPr>
+        <w:t>”</w:t>
+      </w:r>
+      <w:r>
+        <w:rPr>
+          <w:rFonts w:ascii="Times New Roman" w:hAnsi="Times New Roman"/>
+          <w:lang w:val="en-US"/>
+        </w:rPr>
+        <w:t xml:space="preserve">. In order to enforce the requirement for hitting a mid-air opponent with an attack, you would write the following success condition: </w:t>
       </w:r>
       <w:r>
         <w:rPr>
@@ -6309,28 +6331,12 @@
         </w:rPr>
         <w:t>LK -&gt; c</w:t>
       </w:r>
-      <w:bookmarkStart w:id="0" w:name="_GoBack"/>
-      <w:bookmarkEnd w:id="0"/>
-      <w:r>
-        <w:rPr>
-          <w:rFonts w:ascii="Times New Roman" w:hAnsi="Times New Roman"/>
-          <w:lang w:val="en-US"/>
-        </w:rPr>
-        <w:t xml:space="preserve">r.MK is a chain combo. </w:t>
-      </w:r>
-      <w:r>
-        <w:rPr>
-          <w:rFonts w:ascii="Times New Roman" w:hAnsi="Times New Roman"/>
-          <w:lang w:val="en-US"/>
-        </w:rPr>
-        <w:t xml:space="preserve">This </w:t>
-      </w:r>
-      <w:r>
-        <w:rPr>
-          <w:rFonts w:ascii="Times New Roman" w:hAnsi="Times New Roman"/>
-          <w:lang w:val="en-US"/>
-        </w:rPr>
-        <w:t>trial has a carry flag on the first action, which causes the cr.MK to be visually displayed on the same line next to the cr.LK. The ender has a custom success condition requiring it to hit 3 consecutive times.</w:t>
+      <w:r>
+        <w:rPr>
+          <w:rFonts w:ascii="Times New Roman" w:hAnsi="Times New Roman"/>
+          <w:lang w:val="en-US"/>
+        </w:rPr>
+        <w:t>r.MK is a chain combo. This trial has a carry flag on the first action, which causes the cr.MK to be visually displayed on the same line next to the cr.LK. The ender has a custom success condition requiring it to hit 3 consecutive times.</w:t>
       </w:r>
     </w:p>
     <w:p>
@@ -6633,7 +6639,30 @@
           <w:lang w:val="en-US"/>
         </w:rPr>
         <w:br/>
-        <w:t>The next three actions are a chain combo of three normal, displayed on the same line through the use of carry flags. The last action is the ender with no additional parameters.</w:t>
+        <w:t xml:space="preserve">The next three actions are a chain combo of three </w:t>
+      </w:r>
+      <w:proofErr w:type="spellStart"/>
+      <w:r>
+        <w:rPr>
+          <w:rFonts w:ascii="Times New Roman" w:hAnsi="Times New Roman"/>
+          <w:lang w:val="en-US"/>
+        </w:rPr>
+        <w:t>normal</w:t>
+      </w:r>
+      <w:r>
+        <w:rPr>
+          <w:rFonts w:ascii="Times New Roman" w:hAnsi="Times New Roman"/>
+          <w:lang w:val="en-US"/>
+        </w:rPr>
+        <w:t>s</w:t>
+      </w:r>
+      <w:proofErr w:type="spellEnd"/>
+      <w:r>
+        <w:rPr>
+          <w:rFonts w:ascii="Times New Roman" w:hAnsi="Times New Roman"/>
+          <w:lang w:val="en-US"/>
+        </w:rPr>
+        <w:t>, displayed on the same line through the use of carry flags. The last action is the ender with no additional parameters.</w:t>
       </w:r>
     </w:p>
     <w:p>
@@ -7680,7 +7709,52 @@
           <w:lang w:val="en-US"/>
         </w:rPr>
         <w:br/>
-        <w:t>Example: in Street Fighter Alpha 1, character states are taken from a “state machine” address. Within a single action, state values are defined with an interval of 0x18. The end of one action differs from the beginning of the next action by an interval of 0x0b.</w:t>
+        <w:t xml:space="preserve">Example: in Street Fighter Alpha 1, character states are taken from a “state machine” address. Within a single action, state values are defined with an interval of </w:t>
+      </w:r>
+      <w:r>
+        <w:rPr>
+          <w:rFonts w:ascii="Times New Roman" w:hAnsi="Times New Roman"/>
+          <w:i/>
+          <w:lang w:val="en-US"/>
+        </w:rPr>
+        <w:t>0x18</w:t>
+      </w:r>
+      <w:r>
+        <w:rPr>
+          <w:rFonts w:ascii="Times New Roman" w:hAnsi="Times New Roman"/>
+          <w:lang w:val="en-US"/>
+        </w:rPr>
+        <w:t>. The end of one action differs from the beginning of the next action b</w:t>
+      </w:r>
+      <w:r>
+        <w:rPr>
+          <w:rFonts w:ascii="Times New Roman" w:hAnsi="Times New Roman"/>
+          <w:lang w:val="en-US"/>
+        </w:rPr>
+        <w:t xml:space="preserve">y an interval of </w:t>
+      </w:r>
+      <w:r>
+        <w:rPr>
+          <w:rFonts w:ascii="Times New Roman" w:hAnsi="Times New Roman"/>
+          <w:i/>
+          <w:lang w:val="en-US"/>
+        </w:rPr>
+        <w:t>0x1</w:t>
+      </w:r>
+      <w:r>
+        <w:rPr>
+          <w:rFonts w:ascii="Times New Roman" w:hAnsi="Times New Roman"/>
+          <w:i/>
+          <w:lang w:val="en-US"/>
+        </w:rPr>
+        <w:t>b</w:t>
+      </w:r>
+      <w:r>
+        <w:rPr>
+          <w:rFonts w:ascii="Times New Roman" w:hAnsi="Times New Roman"/>
+          <w:lang w:val="en-US"/>
+        </w:rPr>
+        <w:t>.</w:t>
       </w:r>
       <w:r>
         <w:rPr>

</xml_diff>